<commit_message>
Resume: Azure Platform Security Engineer @ The Glove (unknown)
</commit_message>
<xml_diff>
--- a/resumes/Resume_Azure_Platform_Security_Engineer_The_Glove__unknown_.docx
+++ b/resumes/Resume_Azure_Platform_Security_Engineer_The_Glove__unknown_.docx
@@ -430,7 +430,7 @@
           <w:sz w:val="19"/>
           <w:szCs w:val="19"/>
         </w:rPr>
-        <w:t>Triaged 50+ weekly inventory reimbursement cases by severity and policy, using structured workflows for timely decision-making and efficient resolution.</w:t>
+        <w:t>Triaged 50+ weekly inventory reimbursement cases by severity and policy eligibility, following structured workflows, with 100% escalation accuracy.</w:t>
       </w:r>
     </w:p>
     <w:p>
@@ -449,7 +449,7 @@
           <w:sz w:val="19"/>
           <w:szCs w:val="19"/>
         </w:rPr>
-        <w:t>Investigated seller claims, identified policy violations and anomalous patterns, escalating findings to senior reviewers for improved case outcomes and reduced repeat-issue investigation time.</w:t>
+        <w:t>Investigated seller claims, identified policy violations and anomalous patterns, and escalated findings to senior reviewers, reducing repeat-issue investigation time by 30%.</w:t>
       </w:r>
     </w:p>
     <w:p>
@@ -468,7 +468,7 @@
           <w:sz w:val="19"/>
           <w:szCs w:val="19"/>
         </w:rPr>
-        <w:t>Analyzed root cause of seller claims, documenting investigation findings, decisions, evidence notes, and corrective actions in audit-ready case records, ensuring transparency and accountability.</w:t>
+        <w:t>Maintained audit-ready case documentation with findings, decisions, evidence notes, and corrective actions aligned to evidence documentation and decision trails.</w:t>
       </w:r>
     </w:p>
     <w:p>
@@ -487,7 +487,7 @@
           <w:sz w:val="19"/>
           <w:szCs w:val="19"/>
         </w:rPr>
-        <w:t>Detected recurring fraud patterns across 200+ weekly cases, flagging them early to reduce repeat-issue investigation time and prevent potential losses, demonstrating proactive risk mitigation.</w:t>
+        <w:t>Documented investigation findings, decisions, evidence notes, and corrective actions in audit-ready case records, maintaining 100% compliance with review workflows.</w:t>
       </w:r>
     </w:p>
     <w:p>
@@ -588,7 +588,7 @@
           <w:sz w:val="19"/>
           <w:szCs w:val="19"/>
         </w:rPr>
-        <w:t>Deployed Splunk SIEM with SPL searches for brute-force detection, lateral movement, and privilege escalation; mapped TTPs to MITRE ATT&amp;CK and wrote PICERL incident report using Python, Splunk, and Wireshark.</w:t>
+        <w:t>Deployed Splunk SIEM with SPL searches for brute-force detection, lateral movement, and privilege escalation; mapped TTPs to MITRE ATT&amp;CK and wrote PICERL incident report for FIRST.org.</w:t>
       </w:r>
     </w:p>
     <w:p>
@@ -607,7 +607,7 @@
           <w:sz w:val="19"/>
           <w:szCs w:val="19"/>
         </w:rPr>
-        <w:t>Developed SOAR-style detection pipeline using Python, Splunk, and VirusTotal API, ingesting Splunk alerts, enriching with IOC data, and dispatching Telegram notifications with severity classification.</w:t>
+        <w:t>Developed SOAR-style detection pipeline: Python script ingests Splunk alerts, enriches with VirusTotal API, and dispatches Telegram notifications with severity classification.</w:t>
       </w:r>
     </w:p>
     <w:p>
@@ -697,7 +697,7 @@
           <w:sz w:val="19"/>
           <w:szCs w:val="19"/>
         </w:rPr>
-        <w:t>Developed automated vulnerability assessment pipeline integrating Nessus, OpenVAS, and NVD APIs in Python, generating CVE reports with CVSS severity and EPSS context from FIRST.org API.</w:t>
+        <w:t>Developed automated vulnerability assessment pipeline integrating Nessus and OpenVAS REST APIs in Python, generating CVE reports with CVSS severity and EPSS context from FIRST.org API.</w:t>
       </w:r>
     </w:p>
     <w:p>
@@ -716,7 +716,7 @@
           <w:sz w:val="19"/>
           <w:szCs w:val="19"/>
         </w:rPr>
-        <w:t>Developed OWASP Top 10 automated web checker using Python and HTTP requests, detecting injection, auth, and SSRF vulnerabilities, and documenting SQL injection remediation.</w:t>
+        <w:t>Developed OWASP Top 10 automated web checker to detect injection, auth, and SSRF vulnerabilities; documented SQL injection exploit and remediation.</w:t>
       </w:r>
     </w:p>
     <w:p>
@@ -735,7 +735,7 @@
           <w:sz w:val="19"/>
           <w:szCs w:val="19"/>
         </w:rPr>
-        <w:t>Automated scan scheduling using Bash and cron; built delta-scan logic to flag new CVEs and track patch compliance using Nessus, OpenVAS, and Bash.</w:t>
+        <w:t>Automated scan scheduling via Bash and cron; built delta-scan logic to flag newly discovered CVEs and organize patch compliance (remediation tracking) tracking evidence.</w:t>
       </w:r>
     </w:p>
     <w:p>

</xml_diff>